<commit_message>
continue the idf documentation
</commit_message>
<xml_diff>
--- a/Real_World_Cases/חידת_צהל_2025_חנוכה/Documentation.docx
+++ b/Real_World_Cases/חידת_צהל_2025_חנוכה/Documentation.docx
@@ -499,27 +499,15 @@
           <w14:ligatures w14:val="none"/>
         </w:rPr>
       </w:pPr>
-      <w:proofErr w:type="spellStart"/>
-      <w:r>
-        <w:rPr>
-          <w:rFonts w:asciiTheme="minorBidi" w:eastAsia="Times New Roman" w:hAnsiTheme="minorBidi"/>
-          <w:b/>
-          <w:bCs/>
-          <w:kern w:val="0"/>
-          <w14:ligatures w14:val="none"/>
-        </w:rPr>
-        <w:t>FCvkQ#c</w:t>
-      </w:r>
-      <w:proofErr w:type="spellEnd"/>
-      <w:r>
-        <w:rPr>
-          <w:rFonts w:asciiTheme="minorBidi" w:eastAsia="Times New Roman" w:hAnsiTheme="minorBidi"/>
-          <w:b/>
-          <w:bCs/>
-          <w:kern w:val="0"/>
-          <w14:ligatures w14:val="none"/>
-        </w:rPr>
-        <w:t>(U]h7p.+W2?1^Wc4RR</w:t>
+      <w:r>
+        <w:rPr>
+          <w:rFonts w:asciiTheme="minorBidi" w:eastAsia="Times New Roman" w:hAnsiTheme="minorBidi"/>
+          <w:b/>
+          <w:bCs/>
+          <w:kern w:val="0"/>
+          <w14:ligatures w14:val="none"/>
+        </w:rPr>
+        <w:t>FCvkQ#c(U]h7p.+W2?1^Wc4RR</w:t>
       </w:r>
     </w:p>
     <w:p>
@@ -640,29 +628,7 @@
           <w:rtl/>
           <w14:ligatures w14:val="none"/>
         </w:rPr>
-        <w:t xml:space="preserve">קשת וושינגטון. כך </w:t>
-      </w:r>
-      <w:proofErr w:type="spellStart"/>
-      <w:r>
-        <w:rPr>
-          <w:rFonts w:ascii="Arial" w:eastAsia="Times New Roman" w:hAnsi="Arial" w:cs="Arial" w:hint="cs"/>
-          <w:color w:val="30323F"/>
-          <w:kern w:val="0"/>
-          <w:rtl/>
-          <w14:ligatures w14:val="none"/>
-        </w:rPr>
-        <w:t>נראת</w:t>
-      </w:r>
-      <w:proofErr w:type="spellEnd"/>
-      <w:r>
-        <w:rPr>
-          <w:rFonts w:ascii="Arial" w:eastAsia="Times New Roman" w:hAnsi="Arial" w:cs="Arial" w:hint="cs"/>
-          <w:color w:val="30323F"/>
-          <w:kern w:val="0"/>
-          <w:rtl/>
-          <w14:ligatures w14:val="none"/>
-        </w:rPr>
-        <w:t xml:space="preserve"> </w:t>
+        <w:t xml:space="preserve">קשת וושינגטון. כך נראת </w:t>
       </w:r>
       <w:hyperlink r:id="rId6" w:history="1">
         <w:r>
@@ -673,17 +639,7 @@
             <w:rtl/>
             <w14:ligatures w14:val="none"/>
           </w:rPr>
-          <w:t>מפ</w:t>
-        </w:r>
-        <w:r>
-          <w:rPr>
-            <w:rStyle w:val="Hyperlink"/>
-            <w:rFonts w:ascii="Arial" w:eastAsia="Times New Roman" w:hAnsi="Arial" w:cs="Arial" w:hint="cs"/>
-            <w:kern w:val="0"/>
-            <w:rtl/>
-            <w14:ligatures w14:val="none"/>
-          </w:rPr>
-          <w:t>ת האזור</w:t>
+          <w:t>מפת האזור</w:t>
         </w:r>
       </w:hyperlink>
       <w:r>
@@ -710,6 +666,7 @@
       <w:r>
         <w:rPr>
           <w:rFonts w:ascii="Arial" w:eastAsia="Times New Roman" w:hAnsi="Arial" w:cs="Arial"/>
+          <w:noProof/>
           <w:color w:val="30323F"/>
           <w:kern w:val="0"/>
           <w:rtl/>
@@ -838,6 +795,7 @@
           <w:rFonts w:ascii="Arial" w:eastAsia="Times New Roman" w:hAnsi="Arial" w:cs="Arial"/>
           <w:b/>
           <w:bCs/>
+          <w:noProof/>
           <w:color w:val="30323F"/>
           <w:kern w:val="0"/>
           <w:u w:val="single"/>
@@ -993,6 +951,7 @@
       <w:r>
         <w:rPr>
           <w:rFonts w:ascii="Arial" w:eastAsia="Times New Roman" w:hAnsi="Arial" w:cs="Arial"/>
+          <w:noProof/>
           <w:color w:val="30323F"/>
           <w:kern w:val="0"/>
           <w:rtl/>
@@ -1079,6 +1038,7 @@
       <w:r>
         <w:rPr>
           <w:rFonts w:ascii="Arial" w:eastAsia="Times New Roman" w:hAnsi="Arial" w:cs="Arial"/>
+          <w:noProof/>
           <w:color w:val="30323F"/>
           <w:kern w:val="0"/>
           <w:rtl/>
@@ -1155,16 +1115,16 @@
         <w:pStyle w:val="a9"/>
         <w:bidi/>
         <w:rPr>
-          <w:rFonts w:ascii="Arial" w:eastAsia="Times New Roman" w:hAnsi="Arial" w:cs="Arial" w:hint="cs"/>
-          <w:color w:val="30323F"/>
-          <w:kern w:val="0"/>
-          <w:rtl/>
-          <w14:ligatures w14:val="none"/>
-        </w:rPr>
-      </w:pPr>
-      <w:r>
-        <w:rPr>
           <w:rFonts w:ascii="Arial" w:eastAsia="Times New Roman" w:hAnsi="Arial" w:cs="Arial"/>
+          <w:color w:val="30323F"/>
+          <w:kern w:val="0"/>
+          <w14:ligatures w14:val="none"/>
+        </w:rPr>
+      </w:pPr>
+      <w:r>
+        <w:rPr>
+          <w:rFonts w:ascii="Arial" w:eastAsia="Times New Roman" w:hAnsi="Arial" w:cs="Arial"/>
+          <w:noProof/>
           <w:color w:val="30323F"/>
           <w:kern w:val="0"/>
           <w:rtl/>
@@ -1208,6 +1168,1572 @@
         </w:drawing>
       </w:r>
     </w:p>
+    <w:p>
+      <w:pPr>
+        <w:pStyle w:val="a9"/>
+        <w:bidi/>
+        <w:rPr>
+          <w:rFonts w:ascii="Arial" w:eastAsia="Times New Roman" w:hAnsi="Arial" w:cs="Arial" w:hint="cs"/>
+          <w:color w:val="30323F"/>
+          <w:kern w:val="0"/>
+          <w14:ligatures w14:val="none"/>
+        </w:rPr>
+      </w:pPr>
+      <w:r>
+        <w:rPr>
+          <w:rFonts w:ascii="Arial" w:eastAsia="Times New Roman" w:hAnsi="Arial" w:cs="Arial" w:hint="cs"/>
+          <w:color w:val="30323F"/>
+          <w:kern w:val="0"/>
+          <w:rtl/>
+          <w14:ligatures w14:val="none"/>
+        </w:rPr>
+        <w:t>לאחר שלא מצאתי באף צומת כלום, חשבתי אולי לנסות אופציה אחרת.</w:t>
+      </w:r>
+      <w:r>
+        <w:rPr>
+          <w:rFonts w:ascii="Arial" w:eastAsia="Times New Roman" w:hAnsi="Arial" w:cs="Arial" w:hint="cs"/>
+          <w:color w:val="30323F"/>
+          <w:kern w:val="0"/>
+          <w:rtl/>
+          <w14:ligatures w14:val="none"/>
+        </w:rPr>
+        <w:t xml:space="preserve"> ניסיתי לפענח את הקוד בכל מיני הצפנות שקיימות אבל אף אחת מהן לא אבדה אבל התעכבתי קצת על שיטת ההצפנה "צופן קיסר" כיוון שיש אזכור "לאימפריה הרומית" שבה הקיסר שלט</w:t>
+      </w:r>
+      <w:r>
+        <w:rPr>
+          <w:rFonts w:ascii="Arial" w:eastAsia="Times New Roman" w:hAnsi="Arial" w:cs="Arial" w:hint="cs"/>
+          <w:color w:val="30323F"/>
+          <w:kern w:val="0"/>
+          <w:rtl/>
+          <w14:ligatures w14:val="none"/>
+        </w:rPr>
+        <w:t xml:space="preserve"> ("</w:t>
+      </w:r>
+      <w:r>
+        <w:rPr>
+          <w:rFonts w:asciiTheme="minorBidi" w:eastAsia="Times New Roman" w:hAnsiTheme="minorBidi"/>
+          <w:kern w:val="0"/>
+          <w14:ligatures w14:val="none"/>
+        </w:rPr>
+        <w:t>take pride</w:t>
+      </w:r>
+      <w:r>
+        <w:rPr>
+          <w:rFonts w:asciiTheme="minorBidi" w:eastAsia="Times New Roman" w:hAnsiTheme="minorBidi" w:hint="cs"/>
+          <w:kern w:val="0"/>
+          <w:rtl/>
+          <w14:ligatures w14:val="none"/>
+        </w:rPr>
+        <w:t>"</w:t>
+      </w:r>
+      <w:r>
+        <w:rPr>
+          <w:rFonts w:ascii="Arial" w:eastAsia="Times New Roman" w:hAnsi="Arial" w:cs="Arial" w:hint="cs"/>
+          <w:color w:val="30323F"/>
+          <w:kern w:val="0"/>
+          <w:rtl/>
+          <w14:ligatures w14:val="none"/>
+        </w:rPr>
+        <w:t>).</w:t>
+      </w:r>
+    </w:p>
+    <w:p>
+      <w:pPr>
+        <w:pStyle w:val="a9"/>
+        <w:bidi/>
+        <w:rPr>
+          <w:rFonts w:ascii="Arial" w:eastAsia="Times New Roman" w:hAnsi="Arial" w:cs="Arial"/>
+          <w:color w:val="30323F"/>
+          <w:kern w:val="0"/>
+          <w:rtl/>
+          <w14:ligatures w14:val="none"/>
+        </w:rPr>
+      </w:pPr>
+      <w:r>
+        <w:rPr>
+          <w:rFonts w:ascii="Arial" w:eastAsia="Times New Roman" w:hAnsi="Arial" w:cs="Arial" w:hint="cs"/>
+          <w:color w:val="30323F"/>
+          <w:kern w:val="0"/>
+          <w:rtl/>
+          <w14:ligatures w14:val="none"/>
+        </w:rPr>
+        <w:t xml:space="preserve">חישבתי את ההפרש של הרחוב פחות השדרה בכל </w:t>
+      </w:r>
+      <w:r>
+        <w:rPr>
+          <w:rFonts w:ascii="Arial" w:eastAsia="Times New Roman" w:hAnsi="Arial" w:cs="Arial" w:hint="cs"/>
+          <w:color w:val="30323F"/>
+          <w:kern w:val="0"/>
+          <w:rtl/>
+          <w14:ligatures w14:val="none"/>
+        </w:rPr>
+        <w:t xml:space="preserve">צומת ומצאתי </w:t>
+      </w:r>
+      <w:r>
+        <w:rPr>
+          <w:rFonts w:ascii="Arial" w:eastAsia="Times New Roman" w:hAnsi="Arial" w:cs="Arial" w:hint="cs"/>
+          <w:color w:val="30323F"/>
+          <w:kern w:val="0"/>
+          <w:rtl/>
+          <w14:ligatures w14:val="none"/>
+        </w:rPr>
+        <w:t>את ערך ההזזה שיש להזיז כל אחת מהחלקים של המחרוזת של הצופן:</w:t>
+      </w:r>
+    </w:p>
+    <w:p>
+      <w:pPr>
+        <w:spacing w:after="630" w:line="240" w:lineRule="auto"/>
+        <w:jc w:val="center"/>
+        <w:rPr>
+          <w:rFonts w:asciiTheme="minorBidi" w:eastAsia="Times New Roman" w:hAnsiTheme="minorBidi"/>
+          <w:kern w:val="0"/>
+          <w:rtl/>
+          <w14:ligatures w14:val="none"/>
+        </w:rPr>
+      </w:pPr>
+      <w:r>
+        <w:rPr>
+          <w:rFonts w:asciiTheme="minorBidi" w:eastAsia="Times New Roman" w:hAnsiTheme="minorBidi"/>
+          <w:b/>
+          <w:bCs/>
+          <w:color w:val="00B0F0"/>
+          <w:kern w:val="0"/>
+          <w14:ligatures w14:val="none"/>
+        </w:rPr>
+        <w:t>“</w:t>
+      </w:r>
+      <w:r>
+        <w:rPr>
+          <w:rFonts w:asciiTheme="minorBidi" w:eastAsia="Times New Roman" w:hAnsiTheme="minorBidi"/>
+          <w:b/>
+          <w:bCs/>
+          <w:color w:val="00B0F0"/>
+          <w:kern w:val="0"/>
+          <w14:ligatures w14:val="none"/>
+        </w:rPr>
+        <w:t>FCvkQ</w:t>
+      </w:r>
+      <w:r>
+        <w:rPr>
+          <w:rFonts w:asciiTheme="minorBidi" w:eastAsia="Times New Roman" w:hAnsiTheme="minorBidi"/>
+          <w:b/>
+          <w:bCs/>
+          <w:color w:val="00B0F0"/>
+          <w:kern w:val="0"/>
+          <w14:ligatures w14:val="none"/>
+        </w:rPr>
+        <w:t xml:space="preserve">” </w:t>
+      </w:r>
+      <w:r>
+        <w:rPr>
+          <w:rFonts w:asciiTheme="minorBidi" w:eastAsia="Times New Roman" w:hAnsiTheme="minorBidi"/>
+          <w:b/>
+          <w:bCs/>
+          <w:kern w:val="0"/>
+          <w14:ligatures w14:val="none"/>
+        </w:rPr>
+        <w:t>+</w:t>
+      </w:r>
+      <w:r>
+        <w:rPr>
+          <w:rFonts w:asciiTheme="minorBidi" w:eastAsia="Times New Roman" w:hAnsiTheme="minorBidi"/>
+          <w:b/>
+          <w:bCs/>
+          <w:color w:val="00B0F0"/>
+          <w:kern w:val="0"/>
+          <w14:ligatures w14:val="none"/>
+        </w:rPr>
+        <w:t xml:space="preserve"> </w:t>
+      </w:r>
+      <w:r>
+        <w:rPr>
+          <w:rFonts w:asciiTheme="minorBidi" w:eastAsia="Times New Roman" w:hAnsiTheme="minorBidi"/>
+          <w:b/>
+          <w:bCs/>
+          <w:color w:val="00B050"/>
+          <w:kern w:val="0"/>
+          <w14:ligatures w14:val="none"/>
+        </w:rPr>
+        <w:t>“#c(U]</w:t>
+      </w:r>
+      <w:r>
+        <w:rPr>
+          <w:rFonts w:asciiTheme="minorBidi" w:eastAsia="Times New Roman" w:hAnsiTheme="minorBidi"/>
+          <w:b/>
+          <w:bCs/>
+          <w:color w:val="00B050"/>
+          <w:kern w:val="0"/>
+          <w14:ligatures w14:val="none"/>
+        </w:rPr>
+        <w:t xml:space="preserve">” </w:t>
+      </w:r>
+      <w:r>
+        <w:rPr>
+          <w:rFonts w:asciiTheme="minorBidi" w:eastAsia="Times New Roman" w:hAnsiTheme="minorBidi"/>
+          <w:b/>
+          <w:bCs/>
+          <w:kern w:val="0"/>
+          <w14:ligatures w14:val="none"/>
+        </w:rPr>
+        <w:t>+</w:t>
+      </w:r>
+      <w:r>
+        <w:rPr>
+          <w:rFonts w:asciiTheme="minorBidi" w:eastAsia="Times New Roman" w:hAnsiTheme="minorBidi"/>
+          <w:b/>
+          <w:bCs/>
+          <w:color w:val="00B050"/>
+          <w:kern w:val="0"/>
+          <w14:ligatures w14:val="none"/>
+        </w:rPr>
+        <w:t xml:space="preserve"> </w:t>
+      </w:r>
+      <w:r>
+        <w:rPr>
+          <w:rFonts w:asciiTheme="minorBidi" w:eastAsia="Times New Roman" w:hAnsiTheme="minorBidi"/>
+          <w:b/>
+          <w:bCs/>
+          <w:color w:val="E97132" w:themeColor="accent2"/>
+          <w:kern w:val="0"/>
+          <w14:ligatures w14:val="none"/>
+        </w:rPr>
+        <w:t>“h7p.+</w:t>
+      </w:r>
+      <w:r>
+        <w:rPr>
+          <w:rFonts w:asciiTheme="minorBidi" w:eastAsia="Times New Roman" w:hAnsiTheme="minorBidi"/>
+          <w:b/>
+          <w:bCs/>
+          <w:color w:val="E97132" w:themeColor="accent2"/>
+          <w:kern w:val="0"/>
+          <w14:ligatures w14:val="none"/>
+        </w:rPr>
+        <w:t xml:space="preserve">” </w:t>
+      </w:r>
+      <w:r>
+        <w:rPr>
+          <w:rFonts w:asciiTheme="minorBidi" w:eastAsia="Times New Roman" w:hAnsiTheme="minorBidi"/>
+          <w:b/>
+          <w:bCs/>
+          <w:kern w:val="0"/>
+          <w14:ligatures w14:val="none"/>
+        </w:rPr>
+        <w:t>+</w:t>
+      </w:r>
+      <w:r>
+        <w:rPr>
+          <w:rFonts w:asciiTheme="minorBidi" w:eastAsia="Times New Roman" w:hAnsiTheme="minorBidi" w:hint="cs"/>
+          <w:b/>
+          <w:bCs/>
+          <w:color w:val="E97132" w:themeColor="accent2"/>
+          <w:kern w:val="0"/>
+          <w:rtl/>
+          <w14:ligatures w14:val="none"/>
+        </w:rPr>
+        <w:t xml:space="preserve"> </w:t>
+      </w:r>
+      <w:r>
+        <w:rPr>
+          <w:rFonts w:asciiTheme="minorBidi" w:eastAsia="Times New Roman" w:hAnsiTheme="minorBidi"/>
+          <w:b/>
+          <w:bCs/>
+          <w:color w:val="A02B93" w:themeColor="accent5"/>
+          <w:kern w:val="0"/>
+          <w14:ligatures w14:val="none"/>
+        </w:rPr>
+        <w:t>“W2?1^</w:t>
+      </w:r>
+      <w:r>
+        <w:rPr>
+          <w:rFonts w:asciiTheme="minorBidi" w:eastAsia="Times New Roman" w:hAnsiTheme="minorBidi"/>
+          <w:b/>
+          <w:bCs/>
+          <w:color w:val="A02B93" w:themeColor="accent5"/>
+          <w:kern w:val="0"/>
+          <w14:ligatures w14:val="none"/>
+        </w:rPr>
+        <w:t xml:space="preserve">” </w:t>
+      </w:r>
+      <w:r>
+        <w:rPr>
+          <w:rFonts w:asciiTheme="minorBidi" w:eastAsia="Times New Roman" w:hAnsiTheme="minorBidi"/>
+          <w:b/>
+          <w:bCs/>
+          <w:kern w:val="0"/>
+          <w14:ligatures w14:val="none"/>
+        </w:rPr>
+        <w:t>+</w:t>
+      </w:r>
+      <w:r>
+        <w:rPr>
+          <w:rFonts w:asciiTheme="minorBidi" w:eastAsia="Times New Roman" w:hAnsiTheme="minorBidi" w:hint="cs"/>
+          <w:b/>
+          <w:bCs/>
+          <w:color w:val="A02B93" w:themeColor="accent5"/>
+          <w:kern w:val="0"/>
+          <w:rtl/>
+          <w14:ligatures w14:val="none"/>
+        </w:rPr>
+        <w:t xml:space="preserve"> </w:t>
+      </w:r>
+      <w:r>
+        <w:rPr>
+          <w:rFonts w:asciiTheme="minorBidi" w:eastAsia="Times New Roman" w:hAnsiTheme="minorBidi"/>
+          <w:b/>
+          <w:bCs/>
+          <w:color w:val="663300"/>
+          <w:kern w:val="0"/>
+          <w14:ligatures w14:val="none"/>
+        </w:rPr>
+        <w:t>“Wc4RR</w:t>
+      </w:r>
+      <w:r>
+        <w:rPr>
+          <w:rFonts w:asciiTheme="minorBidi" w:eastAsia="Times New Roman" w:hAnsiTheme="minorBidi"/>
+          <w:b/>
+          <w:bCs/>
+          <w:color w:val="663300"/>
+          <w:kern w:val="0"/>
+          <w14:ligatures w14:val="none"/>
+        </w:rPr>
+        <w:t>”</w:t>
+      </w:r>
+    </w:p>
+    <w:p>
+      <w:pPr>
+        <w:pStyle w:val="a9"/>
+        <w:bidi/>
+        <w:rPr>
+          <w:rFonts w:ascii="Arial" w:eastAsia="Times New Roman" w:hAnsi="Arial" w:cs="Arial"/>
+          <w:color w:val="30323F"/>
+          <w:kern w:val="0"/>
+          <w:rtl/>
+          <w14:ligatures w14:val="none"/>
+        </w:rPr>
+      </w:pPr>
+      <w:r>
+        <w:rPr>
+          <w:rFonts w:ascii="Arial" w:eastAsia="Times New Roman" w:hAnsi="Arial" w:cs="Arial" w:hint="cs"/>
+          <w:color w:val="30323F"/>
+          <w:kern w:val="0"/>
+          <w:rtl/>
+          <w14:ligatures w14:val="none"/>
+        </w:rPr>
+        <w:t>חלק 1: הזזת 21 תווים</w:t>
+      </w:r>
+    </w:p>
+    <w:p>
+      <w:pPr>
+        <w:pStyle w:val="a9"/>
+        <w:bidi/>
+        <w:rPr>
+          <w:rFonts w:ascii="Arial" w:eastAsia="Times New Roman" w:hAnsi="Arial" w:cs="Arial"/>
+          <w:color w:val="30323F"/>
+          <w:kern w:val="0"/>
+          <w:rtl/>
+          <w14:ligatures w14:val="none"/>
+        </w:rPr>
+      </w:pPr>
+      <w:r>
+        <w:rPr>
+          <w:rFonts w:ascii="Arial" w:eastAsia="Times New Roman" w:hAnsi="Arial" w:cs="Arial" w:hint="cs"/>
+          <w:color w:val="30323F"/>
+          <w:kern w:val="0"/>
+          <w:rtl/>
+          <w14:ligatures w14:val="none"/>
+        </w:rPr>
+        <w:t>חלק 2: הזזת 9</w:t>
+      </w:r>
+      <w:r>
+        <w:rPr>
+          <w:rFonts w:ascii="Arial" w:eastAsia="Times New Roman" w:hAnsi="Arial" w:cs="Arial" w:hint="cs"/>
+          <w:color w:val="30323F"/>
+          <w:kern w:val="0"/>
+          <w:rtl/>
+          <w14:ligatures w14:val="none"/>
+        </w:rPr>
+        <w:t xml:space="preserve"> </w:t>
+      </w:r>
+      <w:r>
+        <w:rPr>
+          <w:rFonts w:ascii="Arial" w:eastAsia="Times New Roman" w:hAnsi="Arial" w:cs="Arial" w:hint="cs"/>
+          <w:color w:val="30323F"/>
+          <w:kern w:val="0"/>
+          <w:rtl/>
+          <w14:ligatures w14:val="none"/>
+        </w:rPr>
+        <w:t>תווים</w:t>
+      </w:r>
+    </w:p>
+    <w:p>
+      <w:pPr>
+        <w:pStyle w:val="a9"/>
+        <w:bidi/>
+        <w:rPr>
+          <w:rFonts w:ascii="Arial" w:eastAsia="Times New Roman" w:hAnsi="Arial" w:cs="Arial"/>
+          <w:color w:val="30323F"/>
+          <w:kern w:val="0"/>
+          <w:rtl/>
+          <w14:ligatures w14:val="none"/>
+        </w:rPr>
+      </w:pPr>
+      <w:r>
+        <w:rPr>
+          <w:rFonts w:ascii="Arial" w:eastAsia="Times New Roman" w:hAnsi="Arial" w:cs="Arial" w:hint="cs"/>
+          <w:color w:val="30323F"/>
+          <w:kern w:val="0"/>
+          <w:rtl/>
+          <w14:ligatures w14:val="none"/>
+        </w:rPr>
+        <w:t xml:space="preserve">חלק 3: הזזת 7 </w:t>
+      </w:r>
+      <w:r>
+        <w:rPr>
+          <w:rFonts w:ascii="Arial" w:eastAsia="Times New Roman" w:hAnsi="Arial" w:cs="Arial" w:hint="cs"/>
+          <w:color w:val="30323F"/>
+          <w:kern w:val="0"/>
+          <w:rtl/>
+          <w14:ligatures w14:val="none"/>
+        </w:rPr>
+        <w:t>תווים</w:t>
+      </w:r>
+      <w:r>
+        <w:rPr>
+          <w:rFonts w:ascii="Arial" w:eastAsia="Times New Roman" w:hAnsi="Arial" w:cs="Arial" w:hint="cs"/>
+          <w:color w:val="30323F"/>
+          <w:kern w:val="0"/>
+          <w:rtl/>
+          <w14:ligatures w14:val="none"/>
+        </w:rPr>
+        <w:t xml:space="preserve"> (הוספתי </w:t>
+      </w:r>
+      <w:r>
+        <w:rPr>
+          <w:rFonts w:ascii="Arial" w:eastAsia="Times New Roman" w:hAnsi="Arial" w:cs="Arial" w:hint="cs"/>
+          <w:color w:val="30323F"/>
+          <w:kern w:val="0"/>
+          <w:rtl/>
+          <w14:ligatures w14:val="none"/>
+        </w:rPr>
+        <w:t>להפרש 2</w:t>
+      </w:r>
+      <w:r>
+        <w:rPr>
+          <w:rFonts w:ascii="Arial" w:eastAsia="Times New Roman" w:hAnsi="Arial" w:cs="Arial" w:hint="cs"/>
+          <w:color w:val="30323F"/>
+          <w:kern w:val="0"/>
+          <w:rtl/>
+          <w14:ligatures w14:val="none"/>
+        </w:rPr>
+        <w:t xml:space="preserve"> בגלל שהיה כתוב </w:t>
+      </w:r>
+      <w:r>
+        <w:rPr>
+          <w:rFonts w:ascii="Arial" w:eastAsia="Times New Roman" w:hAnsi="Arial" w:cs="Arial" w:hint="cs"/>
+          <w:color w:val="30323F"/>
+          <w:kern w:val="0"/>
+          <w:rtl/>
+          <w14:ligatures w14:val="none"/>
+        </w:rPr>
+        <w:t xml:space="preserve">ברמז </w:t>
+      </w:r>
+      <w:r>
+        <w:rPr>
+          <w:rFonts w:ascii="Arial" w:eastAsia="Times New Roman" w:hAnsi="Arial" w:cs="Arial"/>
+          <w:color w:val="30323F"/>
+          <w:kern w:val="0"/>
+          <w14:ligatures w14:val="none"/>
+        </w:rPr>
+        <w:t>“two steps right”</w:t>
+      </w:r>
+      <w:r>
+        <w:rPr>
+          <w:rFonts w:ascii="Arial" w:eastAsia="Times New Roman" w:hAnsi="Arial" w:cs="Arial" w:hint="cs"/>
+          <w:color w:val="30323F"/>
+          <w:kern w:val="0"/>
+          <w:rtl/>
+          <w14:ligatures w14:val="none"/>
+        </w:rPr>
+        <w:t>)</w:t>
+      </w:r>
+    </w:p>
+    <w:p>
+      <w:pPr>
+        <w:pStyle w:val="a9"/>
+        <w:bidi/>
+        <w:rPr>
+          <w:rFonts w:ascii="Arial" w:eastAsia="Times New Roman" w:hAnsi="Arial" w:cs="Arial"/>
+          <w:color w:val="30323F"/>
+          <w:kern w:val="0"/>
+          <w:rtl/>
+          <w14:ligatures w14:val="none"/>
+        </w:rPr>
+      </w:pPr>
+      <w:r>
+        <w:rPr>
+          <w:rFonts w:ascii="Arial" w:eastAsia="Times New Roman" w:hAnsi="Arial" w:cs="Arial" w:hint="cs"/>
+          <w:color w:val="30323F"/>
+          <w:kern w:val="0"/>
+          <w:rtl/>
+          <w14:ligatures w14:val="none"/>
+        </w:rPr>
+        <w:t>חלק 4: הזזת 3 תווים</w:t>
+      </w:r>
+      <w:r>
+        <w:rPr>
+          <w:rFonts w:ascii="Arial" w:eastAsia="Times New Roman" w:hAnsi="Arial" w:cs="Arial"/>
+          <w:color w:val="30323F"/>
+          <w:kern w:val="0"/>
+          <w14:ligatures w14:val="none"/>
+        </w:rPr>
+        <w:t xml:space="preserve"> </w:t>
+      </w:r>
+      <w:r>
+        <w:rPr>
+          <w:rFonts w:ascii="Arial" w:eastAsia="Times New Roman" w:hAnsi="Arial" w:cs="Arial" w:hint="cs"/>
+          <w:color w:val="30323F"/>
+          <w:kern w:val="0"/>
+          <w:rtl/>
+          <w14:ligatures w14:val="none"/>
+        </w:rPr>
+        <w:t>(</w:t>
+      </w:r>
+      <w:r>
+        <w:rPr>
+          <w:rFonts w:ascii="Arial" w:eastAsia="Times New Roman" w:hAnsi="Arial" w:cs="Arial" w:hint="cs"/>
+          <w:color w:val="30323F"/>
+          <w:kern w:val="0"/>
+          <w:rtl/>
+          <w14:ligatures w14:val="none"/>
+        </w:rPr>
+        <w:t>החסרתי מההפרש</w:t>
+      </w:r>
+      <w:r>
+        <w:rPr>
+          <w:rFonts w:ascii="Arial" w:eastAsia="Times New Roman" w:hAnsi="Arial" w:cs="Arial" w:hint="cs"/>
+          <w:color w:val="30323F"/>
+          <w:kern w:val="0"/>
+          <w:rtl/>
+          <w14:ligatures w14:val="none"/>
+        </w:rPr>
+        <w:t xml:space="preserve"> </w:t>
+      </w:r>
+      <w:r>
+        <w:rPr>
+          <w:rFonts w:ascii="Arial" w:eastAsia="Times New Roman" w:hAnsi="Arial" w:cs="Arial"/>
+          <w:color w:val="30323F"/>
+          <w:kern w:val="0"/>
+          <w14:ligatures w14:val="none"/>
+        </w:rPr>
+        <w:t>3</w:t>
+      </w:r>
+      <w:r>
+        <w:rPr>
+          <w:rFonts w:ascii="Arial" w:eastAsia="Times New Roman" w:hAnsi="Arial" w:cs="Arial" w:hint="cs"/>
+          <w:color w:val="30323F"/>
+          <w:kern w:val="0"/>
+          <w:rtl/>
+          <w14:ligatures w14:val="none"/>
+        </w:rPr>
+        <w:t xml:space="preserve"> בגלל שהיה כתוב ברמז </w:t>
+      </w:r>
+      <w:r>
+        <w:rPr>
+          <w:rFonts w:ascii="Arial" w:eastAsia="Times New Roman" w:hAnsi="Arial" w:cs="Arial"/>
+          <w:color w:val="30323F"/>
+          <w:kern w:val="0"/>
+          <w14:ligatures w14:val="none"/>
+        </w:rPr>
+        <w:t>“</w:t>
+      </w:r>
+      <w:r>
+        <w:rPr>
+          <w:rFonts w:ascii="Arial" w:eastAsia="Times New Roman" w:hAnsi="Arial" w:cs="Arial"/>
+          <w:color w:val="30323F"/>
+          <w:kern w:val="0"/>
+          <w14:ligatures w14:val="none"/>
+        </w:rPr>
+        <w:t>three</w:t>
+      </w:r>
+      <w:r>
+        <w:rPr>
+          <w:rFonts w:ascii="Arial" w:eastAsia="Times New Roman" w:hAnsi="Arial" w:cs="Arial"/>
+          <w:color w:val="30323F"/>
+          <w:kern w:val="0"/>
+          <w14:ligatures w14:val="none"/>
+        </w:rPr>
+        <w:t xml:space="preserve"> steps </w:t>
+      </w:r>
+      <w:r>
+        <w:rPr>
+          <w:rFonts w:ascii="Arial" w:eastAsia="Times New Roman" w:hAnsi="Arial" w:cs="Arial"/>
+          <w:color w:val="30323F"/>
+          <w:kern w:val="0"/>
+          <w14:ligatures w14:val="none"/>
+        </w:rPr>
+        <w:t>left</w:t>
+      </w:r>
+      <w:r>
+        <w:rPr>
+          <w:rFonts w:ascii="Arial" w:eastAsia="Times New Roman" w:hAnsi="Arial" w:cs="Arial"/>
+          <w:color w:val="30323F"/>
+          <w:kern w:val="0"/>
+          <w14:ligatures w14:val="none"/>
+        </w:rPr>
+        <w:t>”</w:t>
+      </w:r>
+      <w:r>
+        <w:rPr>
+          <w:rFonts w:ascii="Arial" w:eastAsia="Times New Roman" w:hAnsi="Arial" w:cs="Arial" w:hint="cs"/>
+          <w:color w:val="30323F"/>
+          <w:kern w:val="0"/>
+          <w:rtl/>
+          <w14:ligatures w14:val="none"/>
+        </w:rPr>
+        <w:t>)</w:t>
+      </w:r>
+    </w:p>
+    <w:p>
+      <w:pPr>
+        <w:pStyle w:val="a9"/>
+        <w:bidi/>
+        <w:rPr>
+          <w:rFonts w:ascii="Arial" w:eastAsia="Times New Roman" w:hAnsi="Arial" w:cs="Arial"/>
+          <w:color w:val="30323F"/>
+          <w:kern w:val="0"/>
+          <w14:ligatures w14:val="none"/>
+        </w:rPr>
+      </w:pPr>
+      <w:r>
+        <w:rPr>
+          <w:rFonts w:ascii="Arial" w:eastAsia="Times New Roman" w:hAnsi="Arial" w:cs="Arial" w:hint="cs"/>
+          <w:color w:val="30323F"/>
+          <w:kern w:val="0"/>
+          <w:rtl/>
+          <w14:ligatures w14:val="none"/>
+        </w:rPr>
+        <w:t xml:space="preserve">חלק 5: הזזת 21 תווים (חזרה של </w:t>
+      </w:r>
+      <w:r>
+        <w:rPr>
+          <w:rFonts w:ascii="Arial" w:eastAsia="Times New Roman" w:hAnsi="Arial" w:cs="Arial" w:hint="cs"/>
+          <w:color w:val="30323F"/>
+          <w:kern w:val="0"/>
+          <w:rtl/>
+          <w14:ligatures w14:val="none"/>
+        </w:rPr>
+        <w:t xml:space="preserve">ערך </w:t>
+      </w:r>
+      <w:r>
+        <w:rPr>
+          <w:rFonts w:ascii="Arial" w:eastAsia="Times New Roman" w:hAnsi="Arial" w:cs="Arial" w:hint="cs"/>
+          <w:color w:val="30323F"/>
+          <w:kern w:val="0"/>
+          <w:rtl/>
+          <w14:ligatures w14:val="none"/>
+        </w:rPr>
+        <w:t>ההזזות לפי הסדר)</w:t>
+      </w:r>
+    </w:p>
+    <w:p>
+      <w:pPr>
+        <w:pStyle w:val="a9"/>
+        <w:bidi/>
+        <w:rPr>
+          <w:rFonts w:ascii="Arial" w:eastAsia="Times New Roman" w:hAnsi="Arial" w:cs="Arial"/>
+          <w:color w:val="30323F"/>
+          <w:kern w:val="0"/>
+          <w14:ligatures w14:val="none"/>
+        </w:rPr>
+      </w:pPr>
+    </w:p>
+    <w:p>
+      <w:pPr>
+        <w:pStyle w:val="a9"/>
+        <w:bidi/>
+        <w:rPr>
+          <w:rFonts w:ascii="Arial" w:eastAsia="Times New Roman" w:hAnsi="Arial" w:cs="Arial"/>
+          <w:color w:val="30323F"/>
+          <w:kern w:val="0"/>
+          <w:rtl/>
+          <w14:ligatures w14:val="none"/>
+        </w:rPr>
+      </w:pPr>
+      <w:r>
+        <w:rPr>
+          <w:rFonts w:ascii="Arial" w:eastAsia="Times New Roman" w:hAnsi="Arial" w:cs="Arial" w:hint="cs"/>
+          <w:color w:val="30323F"/>
+          <w:kern w:val="0"/>
+          <w:rtl/>
+          <w14:ligatures w14:val="none"/>
+        </w:rPr>
+        <w:t>לאחר הזזת כל אחד מהחלקים התקבלה המחרוזת הנ"ל:</w:t>
+      </w:r>
+    </w:p>
+    <w:p>
+      <w:pPr>
+        <w:pStyle w:val="a9"/>
+        <w:bidi/>
+        <w:jc w:val="center"/>
+        <w:rPr>
+          <w:rFonts w:asciiTheme="minorBidi" w:eastAsia="Times New Roman" w:hAnsiTheme="minorBidi"/>
+          <w:b/>
+          <w:bCs/>
+          <w:color w:val="30323F"/>
+          <w:kern w:val="0"/>
+          <w14:ligatures w14:val="none"/>
+        </w:rPr>
+      </w:pPr>
+      <w:r>
+        <w:rPr>
+          <w:rFonts w:asciiTheme="minorBidi" w:eastAsia="Times New Roman" w:hAnsiTheme="minorBidi"/>
+          <w:b/>
+          <w:bCs/>
+          <w:color w:val="00B0F0"/>
+          <w:kern w:val="0"/>
+          <w14:ligatures w14:val="none"/>
+        </w:rPr>
+        <w:t>“</w:t>
+      </w:r>
+      <w:r>
+        <w:rPr>
+          <w:rFonts w:asciiTheme="minorBidi" w:hAnsiTheme="minorBidi"/>
+          <w:b/>
+          <w:bCs/>
+          <w:color w:val="00B0F0"/>
+        </w:rPr>
+        <w:t>1.aP&lt;</w:t>
+      </w:r>
+      <w:r>
+        <w:rPr>
+          <w:rFonts w:asciiTheme="minorBidi" w:eastAsia="Times New Roman" w:hAnsiTheme="minorBidi"/>
+          <w:b/>
+          <w:bCs/>
+          <w:color w:val="00B0F0"/>
+          <w:kern w:val="0"/>
+          <w14:ligatures w14:val="none"/>
+        </w:rPr>
+        <w:t xml:space="preserve">” </w:t>
+      </w:r>
+      <w:r>
+        <w:rPr>
+          <w:rFonts w:asciiTheme="minorBidi" w:eastAsia="Times New Roman" w:hAnsiTheme="minorBidi"/>
+          <w:b/>
+          <w:bCs/>
+          <w:color w:val="30323F"/>
+          <w:kern w:val="0"/>
+          <w14:ligatures w14:val="none"/>
+        </w:rPr>
+        <w:t xml:space="preserve">+ </w:t>
+      </w:r>
+      <w:r>
+        <w:rPr>
+          <w:rFonts w:asciiTheme="minorBidi" w:eastAsia="Times New Roman" w:hAnsiTheme="minorBidi"/>
+          <w:b/>
+          <w:bCs/>
+          <w:color w:val="00B050"/>
+          <w:kern w:val="0"/>
+          <w14:ligatures w14:val="none"/>
+        </w:rPr>
+        <w:t>“</w:t>
+      </w:r>
+      <w:r>
+        <w:rPr>
+          <w:rFonts w:asciiTheme="minorBidi" w:eastAsia="Times New Roman" w:hAnsiTheme="minorBidi"/>
+          <w:b/>
+          <w:bCs/>
+          <w:color w:val="00B050"/>
+          <w:kern w:val="0"/>
+          <w14:ligatures w14:val="none"/>
+        </w:rPr>
+        <w:t>LT</w:t>
+      </w:r>
+      <w:r>
+        <w:rPr>
+          <w:rFonts w:asciiTheme="minorBidi" w:eastAsia="Times New Roman" w:hAnsiTheme="minorBidi"/>
+          <w:b/>
+          <w:bCs/>
+          <w:color w:val="00B050"/>
+          <w:kern w:val="0"/>
+          <w14:ligatures w14:val="none"/>
+        </w:rPr>
+        <w:t/>
+      </w:r>
+      <w:r>
+        <w:rPr>
+          <w:rFonts w:asciiTheme="minorBidi" w:eastAsia="Times New Roman" w:hAnsiTheme="minorBidi"/>
+          <w:b/>
+          <w:bCs/>
+          <w:color w:val="00B050"/>
+          <w:kern w:val="0"/>
+          <w14:ligatures w14:val="none"/>
+        </w:rPr>
+        <w:t/>
+      </w:r>
+      <w:r>
+        <w:rPr>
+          <w:rFonts w:asciiTheme="minorBidi" w:eastAsia="Times New Roman" w:hAnsiTheme="minorBidi"/>
+          <w:b/>
+          <w:bCs/>
+          <w:color w:val="00B050"/>
+          <w:kern w:val="0"/>
+          <w14:ligatures w14:val="none"/>
+        </w:rPr>
+        <w:t>Z</w:t>
+      </w:r>
+      <w:r>
+        <w:rPr>
+          <w:rFonts w:asciiTheme="minorBidi" w:eastAsia="Times New Roman" w:hAnsiTheme="minorBidi"/>
+          <w:b/>
+          <w:bCs/>
+          <w:color w:val="00B050"/>
+          <w:kern w:val="0"/>
+          <w14:ligatures w14:val="none"/>
+        </w:rPr>
+        <w:t xml:space="preserve">” </w:t>
+      </w:r>
+      <w:r>
+        <w:rPr>
+          <w:rFonts w:asciiTheme="minorBidi" w:eastAsia="Times New Roman" w:hAnsiTheme="minorBidi"/>
+          <w:b/>
+          <w:bCs/>
+          <w:color w:val="30323F"/>
+          <w:kern w:val="0"/>
+          <w14:ligatures w14:val="none"/>
+        </w:rPr>
+        <w:t xml:space="preserve">+ </w:t>
+      </w:r>
+      <w:r>
+        <w:rPr>
+          <w:rFonts w:asciiTheme="minorBidi" w:eastAsia="Times New Roman" w:hAnsiTheme="minorBidi"/>
+          <w:b/>
+          <w:bCs/>
+          <w:color w:val="E97132" w:themeColor="accent2"/>
+          <w:kern w:val="0"/>
+          <w14:ligatures w14:val="none"/>
+        </w:rPr>
+        <w:t>“</w:t>
+      </w:r>
+      <w:r>
+        <w:rPr>
+          <w:rFonts w:asciiTheme="minorBidi" w:hAnsiTheme="minorBidi"/>
+          <w:b/>
+          <w:bCs/>
+          <w:color w:val="E97132" w:themeColor="accent2"/>
+        </w:rPr>
+        <w:t>a0i'$</w:t>
+      </w:r>
+      <w:r>
+        <w:rPr>
+          <w:rFonts w:asciiTheme="minorBidi" w:eastAsia="Times New Roman" w:hAnsiTheme="minorBidi"/>
+          <w:b/>
+          <w:bCs/>
+          <w:color w:val="E97132" w:themeColor="accent2"/>
+          <w:kern w:val="0"/>
+          <w14:ligatures w14:val="none"/>
+        </w:rPr>
+        <w:t xml:space="preserve">” </w:t>
+      </w:r>
+      <w:r>
+        <w:rPr>
+          <w:rFonts w:asciiTheme="minorBidi" w:eastAsia="Times New Roman" w:hAnsiTheme="minorBidi"/>
+          <w:b/>
+          <w:bCs/>
+          <w:color w:val="30323F"/>
+          <w:kern w:val="0"/>
+          <w14:ligatures w14:val="none"/>
+        </w:rPr>
+        <w:t xml:space="preserve">+ </w:t>
+      </w:r>
+      <w:r>
+        <w:rPr>
+          <w:rFonts w:asciiTheme="minorBidi" w:eastAsia="Times New Roman" w:hAnsiTheme="minorBidi"/>
+          <w:b/>
+          <w:bCs/>
+          <w:color w:val="A02B93" w:themeColor="accent5"/>
+          <w:kern w:val="0"/>
+          <w14:ligatures w14:val="none"/>
+        </w:rPr>
+        <w:t>“</w:t>
+      </w:r>
+      <w:r>
+        <w:rPr>
+          <w:rFonts w:asciiTheme="minorBidi" w:hAnsiTheme="minorBidi"/>
+          <w:b/>
+          <w:bCs/>
+          <w:color w:val="A02B93" w:themeColor="accent5"/>
+        </w:rPr>
+        <w:t>T/&lt;.[</w:t>
+      </w:r>
+      <w:r>
+        <w:rPr>
+          <w:rFonts w:asciiTheme="minorBidi" w:eastAsia="Times New Roman" w:hAnsiTheme="minorBidi"/>
+          <w:b/>
+          <w:bCs/>
+          <w:color w:val="A02B93" w:themeColor="accent5"/>
+          <w:kern w:val="0"/>
+          <w14:ligatures w14:val="none"/>
+        </w:rPr>
+        <w:t xml:space="preserve">” </w:t>
+      </w:r>
+      <w:r>
+        <w:rPr>
+          <w:rFonts w:asciiTheme="minorBidi" w:eastAsia="Times New Roman" w:hAnsiTheme="minorBidi"/>
+          <w:b/>
+          <w:bCs/>
+          <w:color w:val="30323F"/>
+          <w:kern w:val="0"/>
+          <w14:ligatures w14:val="none"/>
+        </w:rPr>
+        <w:t xml:space="preserve">+ </w:t>
+      </w:r>
+      <w:r>
+        <w:rPr>
+          <w:rFonts w:asciiTheme="minorBidi" w:eastAsia="Times New Roman" w:hAnsiTheme="minorBidi"/>
+          <w:b/>
+          <w:bCs/>
+          <w:color w:val="663300"/>
+          <w:kern w:val="0"/>
+          <w14:ligatures w14:val="none"/>
+        </w:rPr>
+        <w:t>“</w:t>
+      </w:r>
+      <w:r>
+        <w:rPr>
+          <w:rFonts w:asciiTheme="minorBidi" w:hAnsiTheme="minorBidi"/>
+          <w:b/>
+          <w:bCs/>
+          <w:color w:val="663300"/>
+        </w:rPr>
+        <w:t>BH%==</w:t>
+      </w:r>
+      <w:r>
+        <w:rPr>
+          <w:rFonts w:asciiTheme="minorBidi" w:eastAsia="Times New Roman" w:hAnsiTheme="minorBidi"/>
+          <w:b/>
+          <w:bCs/>
+          <w:color w:val="663300"/>
+          <w:kern w:val="0"/>
+          <w14:ligatures w14:val="none"/>
+        </w:rPr>
+        <w:t>”</w:t>
+      </w:r>
+      <w:r>
+        <w:rPr>
+          <w:rFonts w:asciiTheme="minorBidi" w:eastAsia="Times New Roman" w:hAnsiTheme="minorBidi"/>
+          <w:b/>
+          <w:bCs/>
+          <w:color w:val="663300"/>
+          <w:kern w:val="0"/>
+          <w14:ligatures w14:val="none"/>
+        </w:rPr>
+        <w:t xml:space="preserve"> </w:t>
+      </w:r>
+      <w:r>
+        <w:rPr>
+          <w:rFonts w:asciiTheme="minorBidi" w:eastAsia="Times New Roman" w:hAnsiTheme="minorBidi"/>
+          <w:b/>
+          <w:bCs/>
+          <w:color w:val="30323F"/>
+          <w:kern w:val="0"/>
+          <w14:ligatures w14:val="none"/>
+        </w:rPr>
+        <w:t>= “</w:t>
+      </w:r>
+      <w:r>
+        <w:rPr>
+          <w:rFonts w:asciiTheme="minorBidi" w:hAnsiTheme="minorBidi"/>
+          <w:b/>
+          <w:bCs/>
+        </w:rPr>
+        <w:t>1.aP&lt;</w:t>
+      </w:r>
+      <w:r>
+        <w:rPr>
+          <w:rFonts w:asciiTheme="minorBidi" w:eastAsia="Times New Roman" w:hAnsiTheme="minorBidi"/>
+          <w:b/>
+          <w:bCs/>
+          <w:kern w:val="0"/>
+          <w14:ligatures w14:val="none"/>
+        </w:rPr>
+        <w:t xml:space="preserve"> </w:t>
+      </w:r>
+      <w:r>
+        <w:rPr>
+          <w:rFonts w:asciiTheme="minorBidi" w:eastAsia="Times New Roman" w:hAnsiTheme="minorBidi"/>
+          <w:b/>
+          <w:bCs/>
+          <w:kern w:val="0"/>
+          <w14:ligatures w14:val="none"/>
+        </w:rPr>
+        <w:t>LT</w:t>
+      </w:r>
+      <w:r>
+        <w:rPr>
+          <w:rFonts w:asciiTheme="minorBidi" w:eastAsia="Times New Roman" w:hAnsiTheme="minorBidi"/>
+          <w:b/>
+          <w:bCs/>
+          <w:kern w:val="0"/>
+          <w14:ligatures w14:val="none"/>
+        </w:rPr>
+        <w:t/>
+      </w:r>
+      <w:r>
+        <w:rPr>
+          <w:rFonts w:asciiTheme="minorBidi" w:eastAsia="Times New Roman" w:hAnsiTheme="minorBidi"/>
+          <w:b/>
+          <w:bCs/>
+          <w:kern w:val="0"/>
+          <w14:ligatures w14:val="none"/>
+        </w:rPr>
+        <w:t>Z</w:t>
+      </w:r>
+      <w:r>
+        <w:rPr>
+          <w:rFonts w:asciiTheme="minorBidi" w:hAnsiTheme="minorBidi"/>
+          <w:b/>
+          <w:bCs/>
+        </w:rPr>
+        <w:t xml:space="preserve"> </w:t>
+      </w:r>
+      <w:r>
+        <w:rPr>
+          <w:rFonts w:asciiTheme="minorBidi" w:hAnsiTheme="minorBidi"/>
+          <w:b/>
+          <w:bCs/>
+        </w:rPr>
+        <w:t>a0i'$</w:t>
+      </w:r>
+      <w:r>
+        <w:rPr>
+          <w:rFonts w:asciiTheme="minorBidi" w:hAnsiTheme="minorBidi"/>
+          <w:b/>
+          <w:bCs/>
+        </w:rPr>
+        <w:t xml:space="preserve"> </w:t>
+      </w:r>
+      <w:r>
+        <w:rPr>
+          <w:rFonts w:asciiTheme="minorBidi" w:hAnsiTheme="minorBidi"/>
+          <w:b/>
+          <w:bCs/>
+        </w:rPr>
+        <w:t>T/&lt;.[</w:t>
+      </w:r>
+      <w:r>
+        <w:rPr>
+          <w:rFonts w:asciiTheme="minorBidi" w:hAnsiTheme="minorBidi"/>
+          <w:b/>
+          <w:bCs/>
+        </w:rPr>
+        <w:t xml:space="preserve"> </w:t>
+      </w:r>
+      <w:r>
+        <w:rPr>
+          <w:rFonts w:asciiTheme="minorBidi" w:hAnsiTheme="minorBidi"/>
+          <w:b/>
+          <w:bCs/>
+        </w:rPr>
+        <w:t>BH%==</w:t>
+      </w:r>
+      <w:r>
+        <w:rPr>
+          <w:rFonts w:asciiTheme="minorBidi" w:eastAsia="Times New Roman" w:hAnsiTheme="minorBidi"/>
+          <w:b/>
+          <w:bCs/>
+          <w:color w:val="30323F"/>
+          <w:kern w:val="0"/>
+          <w14:ligatures w14:val="none"/>
+        </w:rPr>
+        <w:t>”</w:t>
+      </w:r>
+    </w:p>
+    <w:p>
+      <w:pPr>
+        <w:pStyle w:val="a9"/>
+        <w:bidi/>
+        <w:jc w:val="center"/>
+        <w:rPr>
+          <w:rFonts w:asciiTheme="minorBidi" w:eastAsia="Times New Roman" w:hAnsiTheme="minorBidi"/>
+          <w:color w:val="30323F"/>
+          <w:kern w:val="0"/>
+          <w14:ligatures w14:val="none"/>
+        </w:rPr>
+      </w:pPr>
+    </w:p>
+    <w:p>
+      <w:pPr>
+        <w:pStyle w:val="a9"/>
+        <w:bidi/>
+        <w:rPr>
+          <w:rFonts w:ascii="Arial" w:eastAsia="Times New Roman" w:hAnsi="Arial" w:cs="Arial"/>
+          <w:color w:val="30323F"/>
+          <w:kern w:val="0"/>
+          <w:rtl/>
+          <w14:ligatures w14:val="none"/>
+        </w:rPr>
+      </w:pPr>
+      <w:r>
+        <w:rPr>
+          <w:rFonts w:ascii="Arial" w:eastAsia="Times New Roman" w:hAnsi="Arial" w:cs="Arial" w:hint="cs"/>
+          <w:color w:val="30323F"/>
+          <w:kern w:val="0"/>
+          <w:rtl/>
+          <w14:ligatures w14:val="none"/>
+        </w:rPr>
+        <w:t xml:space="preserve">לאחר </w:t>
+      </w:r>
+      <w:r>
+        <w:rPr>
+          <w:rFonts w:ascii="Arial" w:eastAsia="Times New Roman" w:hAnsi="Arial" w:cs="Arial" w:hint="cs"/>
+          <w:color w:val="30323F"/>
+          <w:kern w:val="0"/>
+          <w:rtl/>
+          <w14:ligatures w14:val="none"/>
+        </w:rPr>
+        <w:t xml:space="preserve">שפענחתי את המחרוזת הסופית באמצעות </w:t>
+      </w:r>
+      <w:r>
+        <w:rPr>
+          <w:rFonts w:ascii="Arial" w:eastAsia="Times New Roman" w:hAnsi="Arial" w:cs="Arial"/>
+          <w:color w:val="30323F"/>
+          <w:kern w:val="0"/>
+          <w14:ligatures w14:val="none"/>
+        </w:rPr>
+        <w:t>Base85</w:t>
+      </w:r>
+      <w:r>
+        <w:rPr>
+          <w:rFonts w:ascii="Arial" w:eastAsia="Times New Roman" w:hAnsi="Arial" w:cs="Arial" w:hint="cs"/>
+          <w:color w:val="30323F"/>
+          <w:kern w:val="0"/>
+          <w:rtl/>
+          <w14:ligatures w14:val="none"/>
+        </w:rPr>
+        <w:t>, קיבלתי את המחרוזת הזאת:</w:t>
+      </w:r>
+    </w:p>
+    <w:p>
+      <w:pPr>
+        <w:pStyle w:val="a9"/>
+        <w:bidi/>
+        <w:rPr>
+          <w:rtl/>
+        </w:rPr>
+      </w:pPr>
+      <w:r>
+        <w:rPr>
+          <w:rFonts w:ascii="Arial" w:eastAsia="Times New Roman" w:hAnsi="Arial" w:cs="Arial" w:hint="cs"/>
+          <w:color w:val="30323F"/>
+          <w:kern w:val="0"/>
+          <w:rtl/>
+          <w14:ligatures w14:val="none"/>
+        </w:rPr>
+        <w:t>"</w:t>
+      </w:r>
+      <w:r>
+        <w:t>Beware the Ides of March</w:t>
+      </w:r>
+      <w:r>
+        <w:rPr>
+          <w:rFonts w:hint="cs"/>
+          <w:rtl/>
+        </w:rPr>
+        <w:t>".</w:t>
+      </w:r>
+    </w:p>
+    <w:p>
+      <w:pPr>
+        <w:pStyle w:val="a9"/>
+        <w:bidi/>
+        <w:rPr>
+          <w:rtl/>
+        </w:rPr>
+      </w:pPr>
+    </w:p>
+    <w:p>
+      <w:pPr>
+        <w:pStyle w:val="a9"/>
+        <w:bidi/>
+        <w:rPr>
+          <w:rtl/>
+        </w:rPr>
+      </w:pPr>
+      <w:r>
+        <w:rPr>
+          <w:rFonts w:hint="cs"/>
+          <w:rtl/>
+        </w:rPr>
+        <w:t xml:space="preserve">ביצעתי קצת מחקר על הביטוי הזה וגיליתי מקורו. תחילה </w:t>
+      </w:r>
+      <w:r>
+        <w:t>“Ides”</w:t>
+      </w:r>
+      <w:r>
+        <w:rPr>
+          <w:rFonts w:hint="cs"/>
+          <w:rtl/>
+        </w:rPr>
+        <w:t xml:space="preserve"> זה מונח שמתאר את היום שבו יש ירח מלא, לאחר מכן גיליתי שבתאריך 15.3 בשנת 44</w:t>
+      </w:r>
+      <w:r>
+        <w:rPr>
+          <w:rFonts w:hint="cs"/>
+          <w:rtl/>
+        </w:rPr>
+        <w:t>-</w:t>
+      </w:r>
+      <w:r>
+        <w:rPr>
+          <w:rFonts w:hint="cs"/>
+          <w:rtl/>
+        </w:rPr>
+        <w:t xml:space="preserve"> לפנה"ס (היום שבו היה הירח המלא בחודש מרץ) קיסר רומא, יוליוס קיסר, נדקר למוות בסנאט הרומאי. בסוף,</w:t>
+      </w:r>
+      <w:r>
+        <w:rPr>
+          <w:rFonts w:hint="cs"/>
+          <w:rtl/>
+        </w:rPr>
+        <w:t xml:space="preserve"> מצאתי שבמחזה "יוליוס קיסר" (שנכתב ע"י שייקספיר) נאמר ליוליוס על ידי מגדת עתידות הביטוי כאזהרה.</w:t>
+      </w:r>
+    </w:p>
+    <w:p>
+      <w:pPr>
+        <w:pStyle w:val="a9"/>
+        <w:bidi/>
+        <w:rPr>
+          <w:rFonts w:cs="Arial"/>
+          <w:rtl/>
+        </w:rPr>
+      </w:pPr>
+      <w:r>
+        <w:rPr>
+          <w:rFonts w:hint="cs"/>
+          <w:rtl/>
+        </w:rPr>
+        <w:t>כיום,</w:t>
+      </w:r>
+      <w:r>
+        <w:rPr>
+          <w:rFonts w:cs="Arial"/>
+          <w:rtl/>
+        </w:rPr>
+        <w:t xml:space="preserve"> </w:t>
+      </w:r>
+      <w:r>
+        <w:rPr>
+          <w:rFonts w:cs="Arial" w:hint="cs"/>
+          <w:rtl/>
+        </w:rPr>
+        <w:t>הביטוי</w:t>
+      </w:r>
+      <w:r>
+        <w:rPr>
+          <w:rFonts w:cs="Arial"/>
+          <w:rtl/>
+        </w:rPr>
+        <w:t xml:space="preserve"> </w:t>
+      </w:r>
+      <w:r>
+        <w:rPr>
+          <w:rFonts w:cs="Arial" w:hint="cs"/>
+          <w:rtl/>
+        </w:rPr>
+        <w:t>משמש</w:t>
+      </w:r>
+      <w:r>
+        <w:rPr>
+          <w:rFonts w:cs="Arial"/>
+          <w:rtl/>
+        </w:rPr>
+        <w:t xml:space="preserve"> </w:t>
+      </w:r>
+      <w:r>
+        <w:rPr>
+          <w:rFonts w:cs="Arial" w:hint="cs"/>
+          <w:rtl/>
+        </w:rPr>
+        <w:t>כביטוי</w:t>
+      </w:r>
+      <w:r>
+        <w:rPr>
+          <w:rFonts w:cs="Arial"/>
+          <w:rtl/>
+        </w:rPr>
+        <w:t xml:space="preserve"> </w:t>
+      </w:r>
+      <w:r>
+        <w:rPr>
+          <w:rFonts w:cs="Arial" w:hint="cs"/>
+          <w:rtl/>
+        </w:rPr>
+        <w:t>לכל</w:t>
+      </w:r>
+      <w:r>
+        <w:rPr>
+          <w:rFonts w:cs="Arial"/>
+          <w:rtl/>
+        </w:rPr>
+        <w:t xml:space="preserve"> </w:t>
+      </w:r>
+      <w:r>
+        <w:rPr>
+          <w:rFonts w:cs="Arial" w:hint="cs"/>
+          <w:rtl/>
+        </w:rPr>
+        <w:t>רגע</w:t>
+      </w:r>
+      <w:r>
+        <w:rPr>
+          <w:rFonts w:cs="Arial"/>
+          <w:rtl/>
+        </w:rPr>
+        <w:t xml:space="preserve"> </w:t>
+      </w:r>
+      <w:r>
+        <w:rPr>
+          <w:rFonts w:cs="Arial" w:hint="cs"/>
+          <w:rtl/>
+        </w:rPr>
+        <w:t>מכריע</w:t>
+      </w:r>
+      <w:r>
+        <w:rPr>
+          <w:rFonts w:cs="Arial"/>
+          <w:rtl/>
+        </w:rPr>
+        <w:t xml:space="preserve"> </w:t>
+      </w:r>
+      <w:r>
+        <w:rPr>
+          <w:rFonts w:cs="Arial" w:hint="cs"/>
+          <w:rtl/>
+        </w:rPr>
+        <w:t>בו</w:t>
+      </w:r>
+      <w:r>
+        <w:rPr>
+          <w:rFonts w:cs="Arial"/>
+          <w:rtl/>
+        </w:rPr>
+        <w:t xml:space="preserve"> </w:t>
+      </w:r>
+      <w:r>
+        <w:rPr>
+          <w:rFonts w:cs="Arial" w:hint="cs"/>
+          <w:rtl/>
+        </w:rPr>
+        <w:t>צפויים</w:t>
+      </w:r>
+      <w:r>
+        <w:rPr>
+          <w:rFonts w:cs="Arial"/>
+          <w:rtl/>
+        </w:rPr>
+        <w:t xml:space="preserve"> </w:t>
+      </w:r>
+      <w:r>
+        <w:rPr>
+          <w:rFonts w:cs="Arial" w:hint="cs"/>
+          <w:rtl/>
+        </w:rPr>
+        <w:t>סכנה</w:t>
+      </w:r>
+      <w:r>
+        <w:rPr>
+          <w:rFonts w:cs="Arial"/>
+          <w:rtl/>
+        </w:rPr>
+        <w:t xml:space="preserve"> </w:t>
+      </w:r>
+      <w:r>
+        <w:rPr>
+          <w:rFonts w:cs="Arial" w:hint="cs"/>
+          <w:rtl/>
+        </w:rPr>
+        <w:t>או</w:t>
+      </w:r>
+      <w:r>
+        <w:rPr>
+          <w:rFonts w:cs="Arial"/>
+          <w:rtl/>
+        </w:rPr>
+        <w:t xml:space="preserve"> </w:t>
+      </w:r>
+      <w:r>
+        <w:rPr>
+          <w:rFonts w:cs="Arial" w:hint="cs"/>
+          <w:rtl/>
+        </w:rPr>
+        <w:t>אסון</w:t>
+      </w:r>
+      <w:r>
+        <w:rPr>
+          <w:rFonts w:cs="Arial"/>
+          <w:rtl/>
+        </w:rPr>
+        <w:t xml:space="preserve">, </w:t>
+      </w:r>
+      <w:r>
+        <w:rPr>
+          <w:rFonts w:cs="Arial" w:hint="cs"/>
+          <w:rtl/>
+        </w:rPr>
+        <w:t>וקורא</w:t>
+      </w:r>
+      <w:r>
+        <w:rPr>
+          <w:rFonts w:cs="Arial"/>
+          <w:rtl/>
+        </w:rPr>
+        <w:t xml:space="preserve"> </w:t>
+      </w:r>
+      <w:r>
+        <w:rPr>
+          <w:rFonts w:cs="Arial" w:hint="cs"/>
+          <w:rtl/>
+        </w:rPr>
+        <w:t>לדרוש</w:t>
+      </w:r>
+      <w:r>
+        <w:rPr>
+          <w:rFonts w:cs="Arial"/>
+          <w:rtl/>
+        </w:rPr>
+        <w:t xml:space="preserve"> </w:t>
+      </w:r>
+      <w:r>
+        <w:rPr>
+          <w:rFonts w:cs="Arial" w:hint="cs"/>
+          <w:rtl/>
+        </w:rPr>
+        <w:t>ערנות</w:t>
+      </w:r>
+      <w:r>
+        <w:rPr>
+          <w:rFonts w:cs="Arial"/>
+          <w:rtl/>
+        </w:rPr>
+        <w:t xml:space="preserve"> </w:t>
+      </w:r>
+      <w:r>
+        <w:rPr>
+          <w:rFonts w:cs="Arial" w:hint="cs"/>
+          <w:rtl/>
+        </w:rPr>
+        <w:t>מפני</w:t>
+      </w:r>
+      <w:r>
+        <w:rPr>
+          <w:rFonts w:cs="Arial"/>
+          <w:rtl/>
+        </w:rPr>
+        <w:t xml:space="preserve"> </w:t>
+      </w:r>
+      <w:r>
+        <w:rPr>
+          <w:rFonts w:cs="Arial" w:hint="cs"/>
+          <w:rtl/>
+        </w:rPr>
+        <w:t>בגידה</w:t>
+      </w:r>
+      <w:r>
+        <w:rPr>
+          <w:rFonts w:cs="Arial"/>
+          <w:rtl/>
+        </w:rPr>
+        <w:t xml:space="preserve"> </w:t>
+      </w:r>
+      <w:r>
+        <w:rPr>
+          <w:rFonts w:cs="Arial" w:hint="cs"/>
+          <w:rtl/>
+        </w:rPr>
+        <w:t>או</w:t>
+      </w:r>
+      <w:r>
+        <w:rPr>
+          <w:rFonts w:cs="Arial"/>
+          <w:rtl/>
+        </w:rPr>
+        <w:t xml:space="preserve"> </w:t>
+      </w:r>
+      <w:r>
+        <w:rPr>
+          <w:rFonts w:cs="Arial" w:hint="cs"/>
+          <w:rtl/>
+        </w:rPr>
+        <w:t>איומים</w:t>
+      </w:r>
+      <w:r>
+        <w:rPr>
+          <w:rFonts w:cs="Arial"/>
+          <w:rtl/>
+        </w:rPr>
+        <w:t xml:space="preserve"> </w:t>
+      </w:r>
+      <w:r>
+        <w:rPr>
+          <w:rFonts w:cs="Arial" w:hint="cs"/>
+          <w:rtl/>
+        </w:rPr>
+        <w:t>נסתרים</w:t>
+      </w:r>
+      <w:r>
+        <w:rPr>
+          <w:rFonts w:cs="Arial"/>
+          <w:rtl/>
+        </w:rPr>
+        <w:t>.</w:t>
+      </w:r>
+    </w:p>
+    <w:p>
+      <w:pPr>
+        <w:pStyle w:val="a9"/>
+        <w:bidi/>
+        <w:rPr>
+          <w:rFonts w:ascii="Arial" w:eastAsia="Times New Roman" w:hAnsi="Arial" w:cs="Arial"/>
+          <w:color w:val="30323F"/>
+          <w:kern w:val="0"/>
+          <w:rtl/>
+          <w14:ligatures w14:val="none"/>
+        </w:rPr>
+      </w:pPr>
+    </w:p>
+    <w:p>
+      <w:pPr>
+        <w:pStyle w:val="a9"/>
+        <w:bidi/>
+        <w:rPr>
+          <w:rFonts w:ascii="Arial" w:eastAsia="Times New Roman" w:hAnsi="Arial" w:cs="Arial" w:hint="cs"/>
+          <w:color w:val="30323F"/>
+          <w:kern w:val="0"/>
+          <w:rtl/>
+          <w14:ligatures w14:val="none"/>
+        </w:rPr>
+      </w:pPr>
+      <w:r>
+        <w:rPr>
+          <w:rFonts w:ascii="Arial" w:eastAsia="Times New Roman" w:hAnsi="Arial" w:cs="Arial" w:hint="cs"/>
+          <w:color w:val="30323F"/>
+          <w:kern w:val="0"/>
+          <w:rtl/>
+          <w14:ligatures w14:val="none"/>
+        </w:rPr>
+        <w:t>בנקודה זאת לא ידעתי מה לעשות יותר מידי עם הפענוח של המחרוזת אז חזרתי לתיאור החידה. שמה נזכרתי שזה מסר שנקלט בתדר סודי של האויב.</w:t>
+      </w:r>
+      <w:r>
+        <w:rPr>
+          <w:rFonts w:ascii="Arial" w:eastAsia="Times New Roman" w:hAnsi="Arial" w:cs="Arial" w:hint="cs"/>
+          <w:color w:val="30323F"/>
+          <w:kern w:val="0"/>
+          <w:rtl/>
+          <w14:ligatures w14:val="none"/>
+        </w:rPr>
+        <w:t xml:space="preserve"> בנוסף, פרט מעניין שגיליתי הוא שהחידה פורסמה ב 15.12.25 מה שאומר שזה ביום הירח המלא של חודש דצמבר.</w:t>
+      </w:r>
+    </w:p>
     <w:sectPr>
       <w:pgSz w:w="11906" w:h="16838" w:code="9"/>
       <w:pgMar w:top="170" w:right="170" w:bottom="170" w:left="170" w:header="720" w:footer="720" w:gutter="0"/>
@@ -1459,11 +2985,127 @@
       </w:pPr>
     </w:lvl>
   </w:abstractNum>
+  <w:abstractNum w:abstractNumId="2" w15:restartNumberingAfterBreak="0">
+    <w:nsid w:val="32483938"/>
+    <w:multiLevelType w:val="hybridMultilevel"/>
+    <w:tmpl w:val="A25648C6"/>
+    <w:lvl w:ilvl="0" w:tplc="04090001">
+      <w:start w:val="1"/>
+      <w:numFmt w:val="bullet"/>
+      <w:lvlText w:val=""/>
+      <w:lvlJc w:val="left"/>
+      <w:pPr>
+        <w:ind w:left="1440" w:hanging="360"/>
+      </w:pPr>
+      <w:rPr>
+        <w:rFonts w:ascii="Symbol" w:hAnsi="Symbol" w:hint="default"/>
+      </w:rPr>
+    </w:lvl>
+    <w:lvl w:ilvl="1" w:tplc="04090003" w:tentative="1">
+      <w:start w:val="1"/>
+      <w:numFmt w:val="bullet"/>
+      <w:lvlText w:val="o"/>
+      <w:lvlJc w:val="left"/>
+      <w:pPr>
+        <w:ind w:left="2160" w:hanging="360"/>
+      </w:pPr>
+      <w:rPr>
+        <w:rFonts w:ascii="Courier New" w:hAnsi="Courier New" w:cs="Courier New" w:hint="default"/>
+      </w:rPr>
+    </w:lvl>
+    <w:lvl w:ilvl="2" w:tplc="04090005" w:tentative="1">
+      <w:start w:val="1"/>
+      <w:numFmt w:val="bullet"/>
+      <w:lvlText w:val=""/>
+      <w:lvlJc w:val="left"/>
+      <w:pPr>
+        <w:ind w:left="2880" w:hanging="360"/>
+      </w:pPr>
+      <w:rPr>
+        <w:rFonts w:ascii="Wingdings" w:hAnsi="Wingdings" w:hint="default"/>
+      </w:rPr>
+    </w:lvl>
+    <w:lvl w:ilvl="3" w:tplc="04090001" w:tentative="1">
+      <w:start w:val="1"/>
+      <w:numFmt w:val="bullet"/>
+      <w:lvlText w:val=""/>
+      <w:lvlJc w:val="left"/>
+      <w:pPr>
+        <w:ind w:left="3600" w:hanging="360"/>
+      </w:pPr>
+      <w:rPr>
+        <w:rFonts w:ascii="Symbol" w:hAnsi="Symbol" w:hint="default"/>
+      </w:rPr>
+    </w:lvl>
+    <w:lvl w:ilvl="4" w:tplc="04090003" w:tentative="1">
+      <w:start w:val="1"/>
+      <w:numFmt w:val="bullet"/>
+      <w:lvlText w:val="o"/>
+      <w:lvlJc w:val="left"/>
+      <w:pPr>
+        <w:ind w:left="4320" w:hanging="360"/>
+      </w:pPr>
+      <w:rPr>
+        <w:rFonts w:ascii="Courier New" w:hAnsi="Courier New" w:cs="Courier New" w:hint="default"/>
+      </w:rPr>
+    </w:lvl>
+    <w:lvl w:ilvl="5" w:tplc="04090005" w:tentative="1">
+      <w:start w:val="1"/>
+      <w:numFmt w:val="bullet"/>
+      <w:lvlText w:val=""/>
+      <w:lvlJc w:val="left"/>
+      <w:pPr>
+        <w:ind w:left="5040" w:hanging="360"/>
+      </w:pPr>
+      <w:rPr>
+        <w:rFonts w:ascii="Wingdings" w:hAnsi="Wingdings" w:hint="default"/>
+      </w:rPr>
+    </w:lvl>
+    <w:lvl w:ilvl="6" w:tplc="04090001" w:tentative="1">
+      <w:start w:val="1"/>
+      <w:numFmt w:val="bullet"/>
+      <w:lvlText w:val=""/>
+      <w:lvlJc w:val="left"/>
+      <w:pPr>
+        <w:ind w:left="5760" w:hanging="360"/>
+      </w:pPr>
+      <w:rPr>
+        <w:rFonts w:ascii="Symbol" w:hAnsi="Symbol" w:hint="default"/>
+      </w:rPr>
+    </w:lvl>
+    <w:lvl w:ilvl="7" w:tplc="04090003" w:tentative="1">
+      <w:start w:val="1"/>
+      <w:numFmt w:val="bullet"/>
+      <w:lvlText w:val="o"/>
+      <w:lvlJc w:val="left"/>
+      <w:pPr>
+        <w:ind w:left="6480" w:hanging="360"/>
+      </w:pPr>
+      <w:rPr>
+        <w:rFonts w:ascii="Courier New" w:hAnsi="Courier New" w:cs="Courier New" w:hint="default"/>
+      </w:rPr>
+    </w:lvl>
+    <w:lvl w:ilvl="8" w:tplc="04090005" w:tentative="1">
+      <w:start w:val="1"/>
+      <w:numFmt w:val="bullet"/>
+      <w:lvlText w:val=""/>
+      <w:lvlJc w:val="left"/>
+      <w:pPr>
+        <w:ind w:left="7200" w:hanging="360"/>
+      </w:pPr>
+      <w:rPr>
+        <w:rFonts w:ascii="Wingdings" w:hAnsi="Wingdings" w:hint="default"/>
+      </w:rPr>
+    </w:lvl>
+  </w:abstractNum>
   <w:num w:numId="1" w16cid:durableId="695279613">
     <w:abstractNumId w:val="1"/>
   </w:num>
   <w:num w:numId="2" w16cid:durableId="1890023670">
     <w:abstractNumId w:val="0"/>
+  </w:num>
+  <w:num w:numId="3" w16cid:durableId="1986660540">
+    <w:abstractNumId w:val="2"/>
   </w:num>
 </w:numbering>
 </file>

</xml_diff>